<commit_message>
fix: suppression du .env et ajout du .gitignore racine
</commit_message>
<xml_diff>
--- a/others/cahier des charges.docx
+++ b/others/cahier des charges.docx
@@ -993,23 +993,7 @@
           <w:b/>
           <w:sz w:val="24"/>
         </w:rPr>
-        <w:t xml:space="preserve">Nombre de personne sur le projet </w:t>
-      </w:r>
-      <w:r>
-        <w:rPr>
-          <w:rFonts w:ascii="Times New Roman" w:hAnsi="Times New Roman" w:cs="Times New Roman"/>
-          <w:b/>
-          <w:sz w:val="24"/>
-        </w:rPr>
-        <w:t>:</w:t>
-      </w:r>
-      <w:r>
-        <w:rPr>
-          <w:rFonts w:ascii="Times New Roman" w:hAnsi="Times New Roman" w:cs="Times New Roman"/>
-          <w:b/>
-          <w:sz w:val="24"/>
-        </w:rPr>
-        <w:t xml:space="preserve"> </w:t>
+        <w:t xml:space="preserve">Nombre de personne sur le projet : </w:t>
       </w:r>
       <w:r>
         <w:rPr>
@@ -1626,6 +1610,8 @@
                 <w:sz w:val="24"/>
               </w:rPr>
             </w:pPr>
+            <w:bookmarkStart w:id="0" w:name="_GoBack"/>
+            <w:bookmarkEnd w:id="0"/>
             <w:r>
               <w:rPr>
                 <w:rFonts w:ascii="Times New Roman" w:hAnsi="Times New Roman" w:cs="Times New Roman"/>
@@ -2144,954 +2130,88 @@
     </w:p>
     <w:p>
       <w:pPr>
+        <w:spacing w:line="360" w:lineRule="auto"/>
+        <w:jc w:val="both"/>
+        <w:rPr>
+          <w:rFonts w:ascii="Times New Roman" w:hAnsi="Times New Roman" w:cs="Times New Roman"/>
+          <w:b/>
+          <w:sz w:val="24"/>
+        </w:rPr>
+      </w:pPr>
+      <w:r>
+        <w:rPr>
+          <w:rFonts w:ascii="Times New Roman" w:hAnsi="Times New Roman" w:cs="Times New Roman"/>
+          <w:b/>
+          <w:sz w:val="24"/>
+        </w:rPr>
+        <w:t>Diagramme de cas d’utilisation UML :</w:t>
+      </w:r>
+    </w:p>
+    <w:p>
+      <w:pPr>
+        <w:spacing w:line="360" w:lineRule="auto"/>
+        <w:jc w:val="both"/>
+        <w:rPr>
+          <w:rFonts w:ascii="Times New Roman" w:hAnsi="Times New Roman" w:cs="Times New Roman"/>
+          <w:b/>
+          <w:sz w:val="24"/>
+        </w:rPr>
+      </w:pPr>
+      <w:r>
+        <w:rPr>
+          <w:rFonts w:ascii="Times New Roman" w:hAnsi="Times New Roman" w:cs="Times New Roman"/>
+          <w:b/>
+          <w:sz w:val="24"/>
+        </w:rPr>
+        <w:t xml:space="preserve">Diagramme de classe </w:t>
+      </w:r>
+      <w:r>
+        <w:rPr>
+          <w:rFonts w:ascii="Times New Roman" w:hAnsi="Times New Roman" w:cs="Times New Roman"/>
+          <w:b/>
+          <w:sz w:val="24"/>
+        </w:rPr>
+        <w:t>UML :</w:t>
+      </w:r>
+    </w:p>
+    <w:p>
+      <w:pPr>
+        <w:spacing w:line="360" w:lineRule="auto"/>
+        <w:jc w:val="both"/>
+        <w:rPr>
+          <w:rFonts w:ascii="Times New Roman" w:hAnsi="Times New Roman" w:cs="Times New Roman"/>
+          <w:b/>
+          <w:sz w:val="24"/>
+        </w:rPr>
+      </w:pPr>
+      <w:r>
+        <w:rPr>
+          <w:rFonts w:ascii="Times New Roman" w:hAnsi="Times New Roman" w:cs="Times New Roman"/>
+          <w:b/>
+          <w:sz w:val="24"/>
+        </w:rPr>
+        <w:t>Modèle logique de données</w:t>
+      </w:r>
+      <w:r>
+        <w:rPr>
+          <w:rFonts w:ascii="Times New Roman" w:hAnsi="Times New Roman" w:cs="Times New Roman"/>
+          <w:b/>
+          <w:sz w:val="24"/>
+        </w:rPr>
+        <w:t> :</w:t>
+      </w:r>
+    </w:p>
+    <w:p>
+      <w:pPr>
         <w:pStyle w:val="Paragraphedeliste"/>
-        <w:numPr>
-          <w:ilvl w:val="0"/>
-          <w:numId w:val="8"/>
-        </w:numPr>
-        <w:spacing w:line="360" w:lineRule="auto"/>
-        <w:jc w:val="both"/>
-        <w:rPr>
-          <w:rFonts w:ascii="Times New Roman" w:hAnsi="Times New Roman" w:cs="Times New Roman"/>
-          <w:b/>
-          <w:sz w:val="24"/>
-        </w:rPr>
-      </w:pPr>
-      <w:r>
-        <w:rPr>
-          <w:rFonts w:ascii="Times New Roman" w:hAnsi="Times New Roman" w:cs="Times New Roman"/>
-          <w:b/>
-          <w:sz w:val="24"/>
-        </w:rPr>
-        <w:t>Utilisateur (Visiteurs</w:t>
-      </w:r>
-      <w:r>
-        <w:rPr>
-          <w:rFonts w:ascii="Times New Roman" w:hAnsi="Times New Roman" w:cs="Times New Roman"/>
-          <w:b/>
-          <w:sz w:val="24"/>
-        </w:rPr>
-        <w:t>, Membre</w:t>
-      </w:r>
-      <w:r>
-        <w:rPr>
-          <w:rFonts w:ascii="Times New Roman" w:hAnsi="Times New Roman" w:cs="Times New Roman"/>
-          <w:b/>
-          <w:sz w:val="24"/>
-        </w:rPr>
-        <w:t>, Organisateurs, Admin)</w:t>
-      </w:r>
-      <w:r>
-        <w:rPr>
-          <w:rFonts w:ascii="Times New Roman" w:hAnsi="Times New Roman" w:cs="Times New Roman"/>
-          <w:sz w:val="24"/>
-        </w:rPr>
-        <w:t> : IdUtilisateur, Nom, Prénom,  Date de naissance, Email, rôle,</w:t>
-      </w:r>
-      <w:r>
-        <w:rPr>
-          <w:rFonts w:ascii="Times New Roman" w:hAnsi="Times New Roman" w:cs="Times New Roman"/>
-          <w:sz w:val="24"/>
-        </w:rPr>
-        <w:t xml:space="preserve"> Photo de profil, date d’inscription,</w:t>
-      </w:r>
-      <w:r>
-        <w:rPr>
-          <w:rFonts w:ascii="Times New Roman" w:hAnsi="Times New Roman" w:cs="Times New Roman"/>
-          <w:sz w:val="24"/>
-        </w:rPr>
-        <w:t xml:space="preserve"> Mot de passe.</w:t>
-      </w:r>
-    </w:p>
-    <w:p>
-      <w:pPr>
-        <w:pStyle w:val="Paragraphedeliste"/>
-        <w:numPr>
-          <w:ilvl w:val="0"/>
-          <w:numId w:val="8"/>
-        </w:numPr>
-        <w:spacing w:line="360" w:lineRule="auto"/>
-        <w:jc w:val="both"/>
-        <w:rPr>
-          <w:rFonts w:ascii="Times New Roman" w:hAnsi="Times New Roman" w:cs="Times New Roman"/>
-          <w:b/>
-          <w:sz w:val="24"/>
-        </w:rPr>
-      </w:pPr>
-      <w:r>
-        <w:rPr>
-          <w:rFonts w:ascii="Times New Roman" w:hAnsi="Times New Roman" w:cs="Times New Roman"/>
-          <w:b/>
-          <w:sz w:val="24"/>
-        </w:rPr>
-        <w:t>Evènement</w:t>
-      </w:r>
-      <w:r>
-        <w:rPr>
-          <w:rFonts w:ascii="Times New Roman" w:hAnsi="Times New Roman" w:cs="Times New Roman"/>
-          <w:b/>
-          <w:sz w:val="24"/>
-        </w:rPr>
-        <w:t> </w:t>
-      </w:r>
-      <w:r>
-        <w:rPr>
-          <w:rFonts w:ascii="Times New Roman" w:hAnsi="Times New Roman" w:cs="Times New Roman"/>
-          <w:sz w:val="24"/>
-        </w:rPr>
-        <w:t xml:space="preserve">: IdEven, Titre, </w:t>
-      </w:r>
-      <w:r>
-        <w:rPr>
-          <w:rFonts w:ascii="Times New Roman" w:hAnsi="Times New Roman" w:cs="Times New Roman"/>
-          <w:sz w:val="24"/>
-        </w:rPr>
-        <w:t>Id</w:t>
-      </w:r>
-      <w:r>
-        <w:rPr>
-          <w:rFonts w:ascii="Times New Roman" w:hAnsi="Times New Roman" w:cs="Times New Roman"/>
-          <w:sz w:val="24"/>
-        </w:rPr>
-        <w:t xml:space="preserve">Organisateur, </w:t>
-      </w:r>
-      <w:r>
-        <w:rPr>
-          <w:rFonts w:ascii="Times New Roman" w:hAnsi="Times New Roman" w:cs="Times New Roman"/>
-          <w:sz w:val="24"/>
-        </w:rPr>
-        <w:t>description</w:t>
-      </w:r>
-      <w:r>
-        <w:rPr>
-          <w:rFonts w:ascii="Times New Roman" w:hAnsi="Times New Roman" w:cs="Times New Roman"/>
-          <w:sz w:val="24"/>
-        </w:rPr>
-        <w:t xml:space="preserve">, Type d’évènement, date de publication, date de lancement, </w:t>
-      </w:r>
-      <w:r>
-        <w:rPr>
-          <w:rFonts w:ascii="Times New Roman" w:hAnsi="Times New Roman" w:cs="Times New Roman"/>
-          <w:sz w:val="24"/>
-        </w:rPr>
-        <w:t>Ville, lieu, statut</w:t>
-      </w:r>
-      <w:r>
-        <w:rPr>
-          <w:rFonts w:ascii="Times New Roman" w:hAnsi="Times New Roman" w:cs="Times New Roman"/>
-          <w:sz w:val="24"/>
-        </w:rPr>
-        <w:t>,</w:t>
-      </w:r>
-      <w:r>
-        <w:rPr>
-          <w:rFonts w:ascii="Times New Roman" w:hAnsi="Times New Roman" w:cs="Times New Roman"/>
-          <w:sz w:val="24"/>
-        </w:rPr>
-        <w:t xml:space="preserve"> nombre de place restant,</w:t>
-      </w:r>
-      <w:r>
-        <w:rPr>
-          <w:rFonts w:ascii="Times New Roman" w:hAnsi="Times New Roman" w:cs="Times New Roman"/>
-          <w:sz w:val="24"/>
-        </w:rPr>
-        <w:t xml:space="preserve"> image de couverture</w:t>
-      </w:r>
-    </w:p>
-    <w:p>
-      <w:pPr>
-        <w:pStyle w:val="Paragraphedeliste"/>
-        <w:numPr>
-          <w:ilvl w:val="0"/>
-          <w:numId w:val="8"/>
-        </w:numPr>
-        <w:spacing w:line="360" w:lineRule="auto"/>
-        <w:jc w:val="both"/>
-        <w:rPr>
-          <w:rFonts w:ascii="Times New Roman" w:hAnsi="Times New Roman" w:cs="Times New Roman"/>
-          <w:b/>
-          <w:sz w:val="24"/>
-        </w:rPr>
-      </w:pPr>
-      <w:r>
-        <w:rPr>
-          <w:rFonts w:ascii="Times New Roman" w:hAnsi="Times New Roman" w:cs="Times New Roman"/>
-          <w:b/>
-          <w:sz w:val="24"/>
-        </w:rPr>
-        <w:t xml:space="preserve">CategorieBillet : </w:t>
-      </w:r>
-      <w:r>
-        <w:rPr>
-          <w:rFonts w:ascii="Times New Roman" w:hAnsi="Times New Roman" w:cs="Times New Roman"/>
-          <w:sz w:val="24"/>
-        </w:rPr>
-        <w:t>IdCategorie, IdEvenement, Nom (Standard, VIP...), Prix, CapacitéTotale, NombreRestant</w:t>
-      </w:r>
-    </w:p>
-    <w:p>
-      <w:pPr>
-        <w:pStyle w:val="Paragraphedeliste"/>
-        <w:numPr>
-          <w:ilvl w:val="0"/>
-          <w:numId w:val="8"/>
-        </w:numPr>
-        <w:spacing w:line="360" w:lineRule="auto"/>
-        <w:jc w:val="both"/>
-        <w:rPr>
-          <w:rFonts w:ascii="Times New Roman" w:hAnsi="Times New Roman" w:cs="Times New Roman"/>
-          <w:sz w:val="24"/>
-        </w:rPr>
-      </w:pPr>
-      <w:r>
-        <w:rPr>
-          <w:rFonts w:ascii="Times New Roman" w:hAnsi="Times New Roman" w:cs="Times New Roman"/>
-          <w:b/>
-          <w:sz w:val="24"/>
-        </w:rPr>
-        <w:t>Billets</w:t>
-      </w:r>
-      <w:r>
-        <w:rPr>
-          <w:rFonts w:ascii="Times New Roman" w:hAnsi="Times New Roman" w:cs="Times New Roman"/>
-          <w:sz w:val="24"/>
-        </w:rPr>
-        <w:t> : IdBillets</w:t>
-      </w:r>
-      <w:r>
-        <w:rPr>
-          <w:rFonts w:ascii="Times New Roman" w:hAnsi="Times New Roman" w:cs="Times New Roman"/>
-          <w:sz w:val="24"/>
-        </w:rPr>
-        <w:t>, IdUtilisateur</w:t>
-      </w:r>
-      <w:r>
-        <w:rPr>
-          <w:rFonts w:ascii="Times New Roman" w:hAnsi="Times New Roman" w:cs="Times New Roman"/>
-          <w:sz w:val="24"/>
-        </w:rPr>
-        <w:t xml:space="preserve">, </w:t>
-      </w:r>
-      <w:r>
-        <w:rPr>
-          <w:rFonts w:ascii="Times New Roman" w:hAnsi="Times New Roman" w:cs="Times New Roman"/>
-          <w:sz w:val="24"/>
-        </w:rPr>
-        <w:t>IdEven</w:t>
-      </w:r>
-      <w:r>
-        <w:rPr>
-          <w:rFonts w:ascii="Times New Roman" w:hAnsi="Times New Roman" w:cs="Times New Roman"/>
-          <w:sz w:val="24"/>
-        </w:rPr>
-        <w:t>,</w:t>
-      </w:r>
-      <w:r>
-        <w:rPr>
-          <w:rFonts w:ascii="Times New Roman" w:hAnsi="Times New Roman" w:cs="Times New Roman"/>
-          <w:sz w:val="24"/>
-        </w:rPr>
-        <w:t xml:space="preserve"> </w:t>
-      </w:r>
-      <w:r>
-        <w:rPr>
-          <w:rFonts w:ascii="Times New Roman" w:hAnsi="Times New Roman" w:cs="Times New Roman"/>
-          <w:sz w:val="24"/>
-        </w:rPr>
-        <w:t>prix</w:t>
-      </w:r>
-      <w:r>
-        <w:rPr>
-          <w:rFonts w:ascii="Times New Roman" w:hAnsi="Times New Roman" w:cs="Times New Roman"/>
-          <w:sz w:val="24"/>
-        </w:rPr>
-        <w:t>, date d’achat, QRcode, statut</w:t>
-      </w:r>
-      <w:r>
-        <w:rPr>
-          <w:rFonts w:ascii="Times New Roman" w:hAnsi="Times New Roman" w:cs="Times New Roman"/>
-          <w:sz w:val="24"/>
-        </w:rPr>
-        <w:t xml:space="preserve"> </w:t>
-      </w:r>
-    </w:p>
-    <w:p>
-      <w:pPr>
-        <w:pStyle w:val="Paragraphedeliste"/>
-        <w:numPr>
-          <w:ilvl w:val="0"/>
-          <w:numId w:val="8"/>
-        </w:numPr>
-        <w:spacing w:line="360" w:lineRule="auto"/>
-        <w:jc w:val="both"/>
-        <w:rPr>
-          <w:rFonts w:ascii="Times New Roman" w:hAnsi="Times New Roman" w:cs="Times New Roman"/>
-          <w:b/>
-          <w:sz w:val="24"/>
-        </w:rPr>
-      </w:pPr>
-      <w:r>
-        <w:rPr>
-          <w:rFonts w:ascii="Times New Roman" w:hAnsi="Times New Roman" w:cs="Times New Roman"/>
-          <w:b/>
-          <w:sz w:val="24"/>
-        </w:rPr>
-        <w:t>News</w:t>
-      </w:r>
-      <w:r>
-        <w:rPr>
-          <w:rFonts w:ascii="Times New Roman" w:hAnsi="Times New Roman" w:cs="Times New Roman"/>
-          <w:sz w:val="24"/>
-        </w:rPr>
-        <w:t xml:space="preserve"> : IdNews, Titre, </w:t>
-      </w:r>
-      <w:r>
-        <w:rPr>
-          <w:rFonts w:ascii="Times New Roman" w:hAnsi="Times New Roman" w:cs="Times New Roman"/>
-          <w:sz w:val="24"/>
-        </w:rPr>
-        <w:t>description</w:t>
-      </w:r>
-      <w:r>
-        <w:rPr>
-          <w:rFonts w:ascii="Times New Roman" w:hAnsi="Times New Roman" w:cs="Times New Roman"/>
-          <w:sz w:val="24"/>
-        </w:rPr>
-        <w:t>, date de publication, image de couverture</w:t>
-      </w:r>
-    </w:p>
-    <w:p>
-      <w:pPr>
-        <w:pStyle w:val="Paragraphedeliste"/>
-        <w:spacing w:line="360" w:lineRule="auto"/>
-        <w:jc w:val="both"/>
-        <w:rPr>
-          <w:rFonts w:ascii="Times New Roman" w:hAnsi="Times New Roman" w:cs="Times New Roman"/>
-          <w:b/>
-          <w:sz w:val="24"/>
-        </w:rPr>
-      </w:pPr>
-      <w:r>
-        <w:rPr>
-          <w:rFonts w:ascii="Times New Roman" w:hAnsi="Times New Roman" w:cs="Times New Roman"/>
-          <w:b/>
-          <w:noProof/>
-          <w:sz w:val="24"/>
-          <w:lang w:eastAsia="fr-FR"/>
-        </w:rPr>
-        <w:lastRenderedPageBreak/>
-        <w:drawing>
-          <wp:anchor distT="0" distB="0" distL="114300" distR="114300" simplePos="0" relativeHeight="251661312" behindDoc="0" locked="0" layoutInCell="1" allowOverlap="1">
-            <wp:simplePos x="0" y="0"/>
-            <wp:positionH relativeFrom="margin">
-              <wp:posOffset>-464820</wp:posOffset>
-            </wp:positionH>
-            <wp:positionV relativeFrom="paragraph">
-              <wp:posOffset>342900</wp:posOffset>
-            </wp:positionV>
-            <wp:extent cx="6042660" cy="4381500"/>
-            <wp:effectExtent l="0" t="0" r="0" b="0"/>
-            <wp:wrapNone/>
-            <wp:docPr id="4" name="Image 4"/>
-            <wp:cNvGraphicFramePr>
-              <a:graphicFrameLocks xmlns:a="http://schemas.openxmlformats.org/drawingml/2006/main" noChangeAspect="1"/>
-            </wp:cNvGraphicFramePr>
-            <a:graphic xmlns:a="http://schemas.openxmlformats.org/drawingml/2006/main">
-              <a:graphicData uri="http://schemas.openxmlformats.org/drawingml/2006/picture">
-                <pic:pic xmlns:pic="http://schemas.openxmlformats.org/drawingml/2006/picture">
-                  <pic:nvPicPr>
-                    <pic:cNvPr id="4" name="Screenshot 2026-02-20 204020.png"/>
-                    <pic:cNvPicPr/>
-                  </pic:nvPicPr>
-                  <pic:blipFill>
-                    <a:blip r:embed="rId7">
-                      <a:extLst>
-                        <a:ext uri="{28A0092B-C50C-407E-A947-70E740481C1C}">
-                          <a14:useLocalDpi xmlns:a14="http://schemas.microsoft.com/office/drawing/2010/main" val="0"/>
-                        </a:ext>
-                      </a:extLst>
-                    </a:blip>
-                    <a:stretch>
-                      <a:fillRect/>
-                    </a:stretch>
-                  </pic:blipFill>
-                  <pic:spPr>
-                    <a:xfrm>
-                      <a:off x="0" y="0"/>
-                      <a:ext cx="6042660" cy="4381500"/>
-                    </a:xfrm>
-                    <a:prstGeom prst="rect">
-                      <a:avLst/>
-                    </a:prstGeom>
-                  </pic:spPr>
-                </pic:pic>
-              </a:graphicData>
-            </a:graphic>
-            <wp14:sizeRelH relativeFrom="page">
-              <wp14:pctWidth>0</wp14:pctWidth>
-            </wp14:sizeRelH>
-            <wp14:sizeRelV relativeFrom="page">
-              <wp14:pctHeight>0</wp14:pctHeight>
-            </wp14:sizeRelV>
-          </wp:anchor>
-        </w:drawing>
-      </w:r>
-      <w:r>
-        <w:rPr>
-          <w:rFonts w:ascii="Times New Roman" w:hAnsi="Times New Roman" w:cs="Times New Roman"/>
-          <w:b/>
-          <w:sz w:val="24"/>
-        </w:rPr>
-        <w:t>Diagramme de cas d’utilisation UML :</w:t>
-      </w:r>
-    </w:p>
-    <w:p>
-      <w:pPr>
-        <w:pStyle w:val="Paragraphedeliste"/>
-        <w:spacing w:line="360" w:lineRule="auto"/>
-        <w:jc w:val="both"/>
-        <w:rPr>
-          <w:rFonts w:ascii="Times New Roman" w:hAnsi="Times New Roman" w:cs="Times New Roman"/>
-          <w:b/>
-          <w:sz w:val="24"/>
-        </w:rPr>
-      </w:pPr>
-    </w:p>
-    <w:p>
-      <w:pPr>
-        <w:pStyle w:val="Paragraphedeliste"/>
-        <w:spacing w:line="360" w:lineRule="auto"/>
-        <w:jc w:val="both"/>
-        <w:rPr>
-          <w:rFonts w:ascii="Times New Roman" w:hAnsi="Times New Roman" w:cs="Times New Roman"/>
-          <w:b/>
-          <w:sz w:val="24"/>
-        </w:rPr>
-      </w:pPr>
-    </w:p>
-    <w:p>
-      <w:pPr>
-        <w:pStyle w:val="Paragraphedeliste"/>
-        <w:spacing w:line="360" w:lineRule="auto"/>
-        <w:jc w:val="both"/>
-        <w:rPr>
-          <w:rFonts w:ascii="Times New Roman" w:hAnsi="Times New Roman" w:cs="Times New Roman"/>
-          <w:b/>
-          <w:sz w:val="24"/>
-        </w:rPr>
-      </w:pPr>
-    </w:p>
-    <w:p>
-      <w:pPr>
-        <w:pStyle w:val="Paragraphedeliste"/>
-        <w:spacing w:line="360" w:lineRule="auto"/>
-        <w:jc w:val="both"/>
-        <w:rPr>
-          <w:rFonts w:ascii="Times New Roman" w:hAnsi="Times New Roman" w:cs="Times New Roman"/>
-          <w:b/>
-          <w:sz w:val="24"/>
-        </w:rPr>
-      </w:pPr>
-    </w:p>
-    <w:p>
-      <w:pPr>
-        <w:pStyle w:val="Paragraphedeliste"/>
-        <w:spacing w:line="360" w:lineRule="auto"/>
-        <w:jc w:val="both"/>
-        <w:rPr>
-          <w:rFonts w:ascii="Times New Roman" w:hAnsi="Times New Roman" w:cs="Times New Roman"/>
-          <w:b/>
-          <w:sz w:val="24"/>
-        </w:rPr>
-      </w:pPr>
-    </w:p>
-    <w:p>
-      <w:pPr>
-        <w:pStyle w:val="Paragraphedeliste"/>
-        <w:spacing w:line="360" w:lineRule="auto"/>
-        <w:jc w:val="both"/>
-        <w:rPr>
-          <w:rFonts w:ascii="Times New Roman" w:hAnsi="Times New Roman" w:cs="Times New Roman"/>
-          <w:b/>
-          <w:sz w:val="24"/>
-        </w:rPr>
-      </w:pPr>
-    </w:p>
-    <w:p>
-      <w:pPr>
-        <w:pStyle w:val="Paragraphedeliste"/>
-        <w:spacing w:line="360" w:lineRule="auto"/>
-        <w:jc w:val="both"/>
-        <w:rPr>
-          <w:rFonts w:ascii="Times New Roman" w:hAnsi="Times New Roman" w:cs="Times New Roman"/>
-          <w:b/>
-          <w:sz w:val="24"/>
-        </w:rPr>
-      </w:pPr>
-    </w:p>
-    <w:p>
-      <w:pPr>
-        <w:pStyle w:val="Paragraphedeliste"/>
-        <w:spacing w:line="360" w:lineRule="auto"/>
-        <w:jc w:val="both"/>
-        <w:rPr>
-          <w:rFonts w:ascii="Times New Roman" w:hAnsi="Times New Roman" w:cs="Times New Roman"/>
-          <w:b/>
-          <w:sz w:val="24"/>
-        </w:rPr>
-      </w:pPr>
-    </w:p>
-    <w:p>
-      <w:pPr>
-        <w:pStyle w:val="Paragraphedeliste"/>
-        <w:spacing w:line="360" w:lineRule="auto"/>
-        <w:jc w:val="both"/>
-        <w:rPr>
-          <w:rFonts w:ascii="Times New Roman" w:hAnsi="Times New Roman" w:cs="Times New Roman"/>
-          <w:b/>
-          <w:sz w:val="24"/>
-        </w:rPr>
-      </w:pPr>
-    </w:p>
-    <w:p>
-      <w:pPr>
-        <w:pStyle w:val="Paragraphedeliste"/>
-        <w:spacing w:line="360" w:lineRule="auto"/>
-        <w:jc w:val="both"/>
-        <w:rPr>
-          <w:rFonts w:ascii="Times New Roman" w:hAnsi="Times New Roman" w:cs="Times New Roman"/>
-          <w:b/>
-          <w:sz w:val="24"/>
-        </w:rPr>
-      </w:pPr>
-    </w:p>
-    <w:p>
-      <w:pPr>
-        <w:pStyle w:val="Paragraphedeliste"/>
-        <w:spacing w:line="360" w:lineRule="auto"/>
-        <w:jc w:val="both"/>
-        <w:rPr>
-          <w:rFonts w:ascii="Times New Roman" w:hAnsi="Times New Roman" w:cs="Times New Roman"/>
-          <w:b/>
-          <w:sz w:val="24"/>
-        </w:rPr>
-      </w:pPr>
-    </w:p>
-    <w:p>
-      <w:pPr>
-        <w:pStyle w:val="Paragraphedeliste"/>
-        <w:spacing w:line="360" w:lineRule="auto"/>
-        <w:jc w:val="both"/>
-        <w:rPr>
-          <w:rFonts w:ascii="Times New Roman" w:hAnsi="Times New Roman" w:cs="Times New Roman"/>
-          <w:b/>
-          <w:sz w:val="24"/>
-        </w:rPr>
-      </w:pPr>
-    </w:p>
-    <w:p>
-      <w:pPr>
-        <w:pStyle w:val="Paragraphedeliste"/>
-        <w:spacing w:line="360" w:lineRule="auto"/>
-        <w:jc w:val="both"/>
-        <w:rPr>
-          <w:rFonts w:ascii="Times New Roman" w:hAnsi="Times New Roman" w:cs="Times New Roman"/>
-          <w:b/>
-          <w:sz w:val="24"/>
-        </w:rPr>
-      </w:pPr>
-    </w:p>
-    <w:p>
-      <w:pPr>
-        <w:pStyle w:val="Paragraphedeliste"/>
-        <w:spacing w:line="360" w:lineRule="auto"/>
-        <w:jc w:val="both"/>
-        <w:rPr>
-          <w:rFonts w:ascii="Times New Roman" w:hAnsi="Times New Roman" w:cs="Times New Roman"/>
-          <w:b/>
-          <w:sz w:val="24"/>
-        </w:rPr>
-      </w:pPr>
-    </w:p>
-    <w:p>
-      <w:pPr>
-        <w:pStyle w:val="Paragraphedeliste"/>
-        <w:spacing w:line="360" w:lineRule="auto"/>
-        <w:jc w:val="both"/>
-        <w:rPr>
-          <w:rFonts w:ascii="Times New Roman" w:hAnsi="Times New Roman" w:cs="Times New Roman"/>
-          <w:b/>
-          <w:sz w:val="24"/>
-        </w:rPr>
-      </w:pPr>
-    </w:p>
-    <w:p>
-      <w:pPr>
-        <w:spacing w:line="360" w:lineRule="auto"/>
-        <w:jc w:val="both"/>
-        <w:rPr>
-          <w:rFonts w:ascii="Times New Roman" w:hAnsi="Times New Roman" w:cs="Times New Roman"/>
-          <w:b/>
-          <w:sz w:val="24"/>
-        </w:rPr>
-      </w:pPr>
-    </w:p>
-    <w:p>
-      <w:pPr>
-        <w:spacing w:line="360" w:lineRule="auto"/>
-        <w:jc w:val="both"/>
-        <w:rPr>
-          <w:rFonts w:ascii="Times New Roman" w:hAnsi="Times New Roman" w:cs="Times New Roman"/>
-          <w:b/>
-          <w:sz w:val="24"/>
-        </w:rPr>
-      </w:pPr>
-    </w:p>
-    <w:p>
-      <w:pPr>
-        <w:spacing w:line="360" w:lineRule="auto"/>
-        <w:jc w:val="both"/>
-        <w:rPr>
-          <w:rFonts w:ascii="Times New Roman" w:hAnsi="Times New Roman" w:cs="Times New Roman"/>
-          <w:b/>
-          <w:sz w:val="24"/>
-        </w:rPr>
-      </w:pPr>
-      <w:r>
-        <w:rPr>
-          <w:rFonts w:ascii="Times New Roman" w:hAnsi="Times New Roman" w:cs="Times New Roman"/>
-          <w:b/>
-          <w:noProof/>
-          <w:sz w:val="24"/>
-          <w:lang w:eastAsia="fr-FR"/>
-        </w:rPr>
-        <w:drawing>
-          <wp:anchor distT="0" distB="0" distL="114300" distR="114300" simplePos="0" relativeHeight="251659264" behindDoc="0" locked="0" layoutInCell="1" allowOverlap="1">
-            <wp:simplePos x="0" y="0"/>
-            <wp:positionH relativeFrom="margin">
-              <wp:align>center</wp:align>
-            </wp:positionH>
-            <wp:positionV relativeFrom="paragraph">
-              <wp:posOffset>290195</wp:posOffset>
-            </wp:positionV>
-            <wp:extent cx="5859780" cy="4055142"/>
-            <wp:effectExtent l="0" t="0" r="7620" b="2540"/>
-            <wp:wrapNone/>
-            <wp:docPr id="2" name="Image 2"/>
-            <wp:cNvGraphicFramePr>
-              <a:graphicFrameLocks xmlns:a="http://schemas.openxmlformats.org/drawingml/2006/main" noChangeAspect="1"/>
-            </wp:cNvGraphicFramePr>
-            <a:graphic xmlns:a="http://schemas.openxmlformats.org/drawingml/2006/main">
-              <a:graphicData uri="http://schemas.openxmlformats.org/drawingml/2006/picture">
-                <pic:pic xmlns:pic="http://schemas.openxmlformats.org/drawingml/2006/picture">
-                  <pic:nvPicPr>
-                    <pic:cNvPr id="2" name="Screenshot 2026-02-20 201437.png"/>
-                    <pic:cNvPicPr/>
-                  </pic:nvPicPr>
-                  <pic:blipFill>
-                    <a:blip r:embed="rId8">
-                      <a:extLst>
-                        <a:ext uri="{28A0092B-C50C-407E-A947-70E740481C1C}">
-                          <a14:useLocalDpi xmlns:a14="http://schemas.microsoft.com/office/drawing/2010/main" val="0"/>
-                        </a:ext>
-                      </a:extLst>
-                    </a:blip>
-                    <a:stretch>
-                      <a:fillRect/>
-                    </a:stretch>
-                  </pic:blipFill>
-                  <pic:spPr>
-                    <a:xfrm>
-                      <a:off x="0" y="0"/>
-                      <a:ext cx="5859780" cy="4055142"/>
-                    </a:xfrm>
-                    <a:prstGeom prst="rect">
-                      <a:avLst/>
-                    </a:prstGeom>
-                  </pic:spPr>
-                </pic:pic>
-              </a:graphicData>
-            </a:graphic>
-            <wp14:sizeRelH relativeFrom="page">
-              <wp14:pctWidth>0</wp14:pctWidth>
-            </wp14:sizeRelH>
-            <wp14:sizeRelV relativeFrom="page">
-              <wp14:pctHeight>0</wp14:pctHeight>
-            </wp14:sizeRelV>
-          </wp:anchor>
-        </w:drawing>
-      </w:r>
-      <w:r>
-        <w:rPr>
-          <w:rFonts w:ascii="Times New Roman" w:hAnsi="Times New Roman" w:cs="Times New Roman"/>
-          <w:b/>
-          <w:sz w:val="24"/>
-        </w:rPr>
-        <w:t xml:space="preserve">Diagramme de classe </w:t>
-      </w:r>
-      <w:r>
-        <w:rPr>
-          <w:rFonts w:ascii="Times New Roman" w:hAnsi="Times New Roman" w:cs="Times New Roman"/>
-          <w:b/>
-          <w:sz w:val="24"/>
-        </w:rPr>
-        <w:t>UML :</w:t>
-      </w:r>
-    </w:p>
-    <w:p>
-      <w:pPr>
-        <w:pStyle w:val="Paragraphedeliste"/>
-        <w:spacing w:line="360" w:lineRule="auto"/>
-        <w:jc w:val="both"/>
-        <w:rPr>
-          <w:rFonts w:ascii="Times New Roman" w:hAnsi="Times New Roman" w:cs="Times New Roman"/>
-          <w:b/>
-          <w:sz w:val="24"/>
-        </w:rPr>
-      </w:pPr>
-    </w:p>
-    <w:p>
-      <w:pPr>
-        <w:pStyle w:val="Paragraphedeliste"/>
-        <w:spacing w:line="360" w:lineRule="auto"/>
-        <w:jc w:val="both"/>
-        <w:rPr>
-          <w:rFonts w:ascii="Times New Roman" w:hAnsi="Times New Roman" w:cs="Times New Roman"/>
-          <w:b/>
-          <w:sz w:val="24"/>
-        </w:rPr>
-      </w:pPr>
-    </w:p>
-    <w:p>
-      <w:pPr>
-        <w:pStyle w:val="Paragraphedeliste"/>
-        <w:spacing w:line="360" w:lineRule="auto"/>
-        <w:jc w:val="both"/>
-        <w:rPr>
-          <w:rFonts w:ascii="Times New Roman" w:hAnsi="Times New Roman" w:cs="Times New Roman"/>
-          <w:b/>
-          <w:sz w:val="24"/>
-        </w:rPr>
-      </w:pPr>
-    </w:p>
-    <w:p>
-      <w:pPr>
-        <w:pStyle w:val="Paragraphedeliste"/>
-        <w:spacing w:line="360" w:lineRule="auto"/>
-        <w:jc w:val="both"/>
-        <w:rPr>
-          <w:rFonts w:ascii="Times New Roman" w:hAnsi="Times New Roman" w:cs="Times New Roman"/>
-          <w:b/>
-          <w:sz w:val="24"/>
-        </w:rPr>
-      </w:pPr>
-    </w:p>
-    <w:p>
-      <w:pPr>
-        <w:pStyle w:val="Paragraphedeliste"/>
-        <w:spacing w:line="360" w:lineRule="auto"/>
-        <w:jc w:val="both"/>
-        <w:rPr>
-          <w:rFonts w:ascii="Times New Roman" w:hAnsi="Times New Roman" w:cs="Times New Roman"/>
-          <w:b/>
-          <w:sz w:val="24"/>
-        </w:rPr>
-      </w:pPr>
-    </w:p>
-    <w:p>
-      <w:pPr>
-        <w:pStyle w:val="Paragraphedeliste"/>
-        <w:spacing w:line="360" w:lineRule="auto"/>
-        <w:jc w:val="both"/>
-        <w:rPr>
-          <w:rFonts w:ascii="Times New Roman" w:hAnsi="Times New Roman" w:cs="Times New Roman"/>
-          <w:b/>
-          <w:sz w:val="24"/>
-        </w:rPr>
-      </w:pPr>
-    </w:p>
-    <w:p>
-      <w:pPr>
-        <w:pStyle w:val="Paragraphedeliste"/>
-        <w:spacing w:line="360" w:lineRule="auto"/>
-        <w:jc w:val="both"/>
-        <w:rPr>
-          <w:rFonts w:ascii="Times New Roman" w:hAnsi="Times New Roman" w:cs="Times New Roman"/>
-          <w:b/>
-          <w:sz w:val="24"/>
-        </w:rPr>
-      </w:pPr>
-    </w:p>
-    <w:p>
-      <w:pPr>
-        <w:pStyle w:val="Paragraphedeliste"/>
-        <w:spacing w:line="360" w:lineRule="auto"/>
-        <w:jc w:val="both"/>
-        <w:rPr>
-          <w:rFonts w:ascii="Times New Roman" w:hAnsi="Times New Roman" w:cs="Times New Roman"/>
-          <w:b/>
-          <w:sz w:val="24"/>
-        </w:rPr>
-      </w:pPr>
-    </w:p>
-    <w:p>
-      <w:pPr>
-        <w:pStyle w:val="Paragraphedeliste"/>
-        <w:spacing w:line="360" w:lineRule="auto"/>
-        <w:jc w:val="both"/>
-        <w:rPr>
-          <w:rFonts w:ascii="Times New Roman" w:hAnsi="Times New Roman" w:cs="Times New Roman"/>
-          <w:b/>
-          <w:sz w:val="24"/>
-        </w:rPr>
-      </w:pPr>
-    </w:p>
-    <w:p>
-      <w:pPr>
-        <w:pStyle w:val="Paragraphedeliste"/>
-        <w:spacing w:line="360" w:lineRule="auto"/>
-        <w:jc w:val="both"/>
-        <w:rPr>
-          <w:rFonts w:ascii="Times New Roman" w:hAnsi="Times New Roman" w:cs="Times New Roman"/>
-          <w:b/>
-          <w:sz w:val="24"/>
-        </w:rPr>
-      </w:pPr>
-    </w:p>
-    <w:p>
-      <w:pPr>
-        <w:pStyle w:val="Paragraphedeliste"/>
-        <w:spacing w:line="360" w:lineRule="auto"/>
-        <w:jc w:val="both"/>
-        <w:rPr>
-          <w:rFonts w:ascii="Times New Roman" w:hAnsi="Times New Roman" w:cs="Times New Roman"/>
-          <w:b/>
-          <w:sz w:val="24"/>
-        </w:rPr>
-      </w:pPr>
-    </w:p>
-    <w:p>
-      <w:pPr>
-        <w:pStyle w:val="Paragraphedeliste"/>
-        <w:spacing w:line="360" w:lineRule="auto"/>
-        <w:jc w:val="both"/>
-        <w:rPr>
-          <w:rFonts w:ascii="Times New Roman" w:hAnsi="Times New Roman" w:cs="Times New Roman"/>
-          <w:b/>
-          <w:sz w:val="24"/>
-        </w:rPr>
-      </w:pPr>
-    </w:p>
-    <w:p>
-      <w:pPr>
-        <w:pStyle w:val="Paragraphedeliste"/>
-        <w:spacing w:line="360" w:lineRule="auto"/>
-        <w:jc w:val="both"/>
-        <w:rPr>
-          <w:rFonts w:ascii="Times New Roman" w:hAnsi="Times New Roman" w:cs="Times New Roman"/>
-          <w:b/>
-          <w:sz w:val="24"/>
-        </w:rPr>
-      </w:pPr>
-    </w:p>
-    <w:p>
-      <w:pPr>
-        <w:pStyle w:val="Paragraphedeliste"/>
-        <w:spacing w:line="360" w:lineRule="auto"/>
-        <w:jc w:val="both"/>
-        <w:rPr>
-          <w:rFonts w:ascii="Times New Roman" w:hAnsi="Times New Roman" w:cs="Times New Roman"/>
-          <w:b/>
-          <w:sz w:val="24"/>
-        </w:rPr>
-      </w:pPr>
-      <w:r>
-        <w:rPr>
-          <w:rFonts w:ascii="Times New Roman" w:hAnsi="Times New Roman" w:cs="Times New Roman"/>
-          <w:b/>
-          <w:sz w:val="24"/>
-        </w:rPr>
-        <w:lastRenderedPageBreak/>
-        <w:t>Modèle logique de données</w:t>
-      </w:r>
-    </w:p>
-    <w:p>
-      <w:pPr>
-        <w:pStyle w:val="Paragraphedeliste"/>
-        <w:spacing w:line="360" w:lineRule="auto"/>
-        <w:jc w:val="both"/>
-        <w:rPr>
-          <w:rFonts w:ascii="Times New Roman" w:hAnsi="Times New Roman" w:cs="Times New Roman"/>
-          <w:b/>
-          <w:sz w:val="24"/>
-        </w:rPr>
-      </w:pPr>
-      <w:bookmarkStart w:id="0" w:name="_GoBack"/>
-      <w:r>
-        <w:rPr>
-          <w:rFonts w:ascii="Times New Roman" w:hAnsi="Times New Roman" w:cs="Times New Roman"/>
-          <w:b/>
-          <w:noProof/>
-          <w:sz w:val="24"/>
-          <w:lang w:eastAsia="fr-FR"/>
-        </w:rPr>
-        <w:drawing>
-          <wp:anchor distT="0" distB="0" distL="114300" distR="114300" simplePos="0" relativeHeight="251662336" behindDoc="0" locked="0" layoutInCell="1" allowOverlap="1">
-            <wp:simplePos x="0" y="0"/>
-            <wp:positionH relativeFrom="column">
-              <wp:posOffset>-594360</wp:posOffset>
-            </wp:positionH>
-            <wp:positionV relativeFrom="paragraph">
-              <wp:posOffset>240030</wp:posOffset>
-            </wp:positionV>
-            <wp:extent cx="6118860" cy="4411980"/>
-            <wp:effectExtent l="0" t="0" r="0" b="7620"/>
-            <wp:wrapNone/>
-            <wp:docPr id="5" name="Image 5"/>
-            <wp:cNvGraphicFramePr>
-              <a:graphicFrameLocks xmlns:a="http://schemas.openxmlformats.org/drawingml/2006/main" noChangeAspect="1"/>
-            </wp:cNvGraphicFramePr>
-            <a:graphic xmlns:a="http://schemas.openxmlformats.org/drawingml/2006/main">
-              <a:graphicData uri="http://schemas.openxmlformats.org/drawingml/2006/picture">
-                <pic:pic xmlns:pic="http://schemas.openxmlformats.org/drawingml/2006/picture">
-                  <pic:nvPicPr>
-                    <pic:cNvPr id="5" name="Screenshot 2026-02-20 204210.png"/>
-                    <pic:cNvPicPr/>
-                  </pic:nvPicPr>
-                  <pic:blipFill>
-                    <a:blip r:embed="rId9">
-                      <a:extLst>
-                        <a:ext uri="{28A0092B-C50C-407E-A947-70E740481C1C}">
-                          <a14:useLocalDpi xmlns:a14="http://schemas.microsoft.com/office/drawing/2010/main" val="0"/>
-                        </a:ext>
-                      </a:extLst>
-                    </a:blip>
-                    <a:stretch>
-                      <a:fillRect/>
-                    </a:stretch>
-                  </pic:blipFill>
-                  <pic:spPr>
-                    <a:xfrm>
-                      <a:off x="0" y="0"/>
-                      <a:ext cx="6118860" cy="4411980"/>
-                    </a:xfrm>
-                    <a:prstGeom prst="rect">
-                      <a:avLst/>
-                    </a:prstGeom>
-                  </pic:spPr>
-                </pic:pic>
-              </a:graphicData>
-            </a:graphic>
-            <wp14:sizeRelH relativeFrom="margin">
-              <wp14:pctWidth>0</wp14:pctWidth>
-            </wp14:sizeRelH>
-            <wp14:sizeRelV relativeFrom="margin">
-              <wp14:pctHeight>0</wp14:pctHeight>
-            </wp14:sizeRelV>
-          </wp:anchor>
-        </w:drawing>
-      </w:r>
-      <w:bookmarkEnd w:id="0"/>
+        <w:spacing w:line="360" w:lineRule="auto"/>
+        <w:jc w:val="both"/>
+        <w:rPr>
+          <w:rFonts w:ascii="Times New Roman" w:hAnsi="Times New Roman" w:cs="Times New Roman"/>
+          <w:b/>
+          <w:sz w:val="24"/>
+        </w:rPr>
+      </w:pPr>
     </w:p>
     <w:sectPr>
       <w:pgSz w:w="11906" w:h="16838"/>

</xml_diff>